<commit_message>
update cocomo cost estimation model
</commit_message>
<xml_diff>
--- a/Lab Manual Docs/Exp_12_COCOMO_Cost_Estimation.docx
+++ b/Lab Manual Docs/Exp_12_COCOMO_Cost_Estimation.docx
@@ -62,11 +62,11 @@
     </w:p>
     <w:p>
       <w:r>
-        <w:t>• Understanding of software cost estimation models (Boehm's Constructive Cost Model - COCOMO).</w:t>
+        <w:t>• Understanding of software cost estimation models (Barry Boehm's Basic Constructive Cost Model - COCOMO).</w:t>
         <w:br/>
-        <w:t>• Knowledge of project complexity categories: Organic, Semi-Detached, and Embedded.</w:t>
+        <w:t>• Knowledge of project complexity categories: Organic (small team, familiar domain), Semi-Detached, and Embedded.</w:t>
         <w:br/>
-        <w:t>• Familiarity with mathematical formulas for Effort (Person-Months), Development Time, and Staffing.</w:t>
+        <w:t>• Familiarity with mathematical formulas for Effort (Person-Months), Development Schedule (Months), Staffing, and Budgeting.</w:t>
       </w:r>
     </w:p>
     <w:p>
@@ -85,7 +85,7 @@
     </w:p>
     <w:p>
       <w:r>
-        <w:t>To perform a rigorous cost, effort, and duration estimation for Ledgerly based on empirical Lines of Code (LOC) using the Basic COCOMO model.</w:t>
+        <w:t>To perform a realistic cost, effort, and duration estimation for the Ledgerly Invoice Generator based on effective Lines of Code (LOC) using the Basic COCOMO Organic model tailored to a student/academic software engineering project.</w:t>
       </w:r>
     </w:p>
     <w:p>
@@ -99,7 +99,12 @@
           <w:color w:val="2C3E50"/>
           <w:sz w:val="26"/>
         </w:rPr>
-        <w:t>3. Software Sizing (LOC Count)</w:t>
+        <w:t>3. Software Sizing (Effective LOC Count)</w:t>
+      </w:r>
+    </w:p>
+    <w:p>
+      <w:r>
+        <w:t>For cost estimation, only core application source code (excluding boilerplate comments, blank lines, and external vendor bundles) is considered:</w:t>
       </w:r>
     </w:p>
     <w:tbl>
@@ -137,7 +142,7 @@
                 <w:color w:val="FFFFFF"/>
                 <w:sz w:val="20"/>
               </w:rPr>
-              <w:t>Component / Source File</w:t>
+              <w:t>Module / Component</w:t>
             </w:r>
           </w:p>
         </w:tc>
@@ -163,7 +168,7 @@
                 <w:color w:val="FFFFFF"/>
                 <w:sz w:val="20"/>
               </w:rPr>
-              <w:t>Language / Technology</w:t>
+              <w:t>Technology Stack</w:t>
             </w:r>
           </w:p>
         </w:tc>
@@ -189,7 +194,7 @@
                 <w:color w:val="FFFFFF"/>
                 <w:sz w:val="20"/>
               </w:rPr>
-              <w:t>Lines of Code (LOC)</w:t>
+              <w:t>Effective Lines of Code (LOC)</w:t>
             </w:r>
           </w:p>
         </w:tc>
@@ -216,7 +221,7 @@
                 <w:color w:val="333333"/>
                 <w:sz w:val="19"/>
               </w:rPr>
-              <w:t>index.html (Application Shell &amp; Views)</w:t>
+              <w:t>Application Structure &amp; View Templates</w:t>
             </w:r>
           </w:p>
         </w:tc>
@@ -266,7 +271,7 @@
                 <w:color w:val="333333"/>
                 <w:sz w:val="19"/>
               </w:rPr>
-              <w:t>380 LOC</w:t>
+              <w:t>250 LOC</w:t>
             </w:r>
           </w:p>
         </w:tc>
@@ -293,7 +298,7 @@
                 <w:color w:val="333333"/>
                 <w:sz w:val="19"/>
               </w:rPr>
-              <w:t>style.css (Design System, Tokens, Print)</w:t>
+              <w:t>Design System, Layouts &amp; Print Styling</w:t>
             </w:r>
           </w:p>
         </w:tc>
@@ -343,7 +348,7 @@
                 <w:color w:val="333333"/>
                 <w:sz w:val="19"/>
               </w:rPr>
-              <w:t>1,220 LOC</w:t>
+              <w:t>750 LOC</w:t>
             </w:r>
           </w:p>
         </w:tc>
@@ -370,7 +375,7 @@
                 <w:color w:val="333333"/>
                 <w:sz w:val="19"/>
               </w:rPr>
-              <w:t>script.js (Router, Controllers, Engine)</w:t>
+              <w:t>Core Calculation, Router &amp; Invoice Logic</w:t>
             </w:r>
           </w:p>
         </w:tc>
@@ -420,7 +425,7 @@
                 <w:color w:val="333333"/>
                 <w:sz w:val="19"/>
               </w:rPr>
-              <w:t>3,450 LOC</w:t>
+              <w:t>1,350 LOC</w:t>
             </w:r>
           </w:p>
         </w:tc>
@@ -447,7 +452,7 @@
                 <w:color w:val="333333"/>
                 <w:sz w:val="19"/>
               </w:rPr>
-              <w:t>sw.js (Service Worker &amp; Cache Rules)</w:t>
+              <w:t>Offline Cache &amp; Service Worker</w:t>
             </w:r>
           </w:p>
         </w:tc>
@@ -497,7 +502,7 @@
                 <w:color w:val="333333"/>
                 <w:sz w:val="19"/>
               </w:rPr>
-              <w:t>80 LOC</w:t>
+              <w:t>50 LOC</w:t>
             </w:r>
           </w:p>
         </w:tc>
@@ -524,7 +529,7 @@
                 <w:color w:val="333333"/>
                 <w:sz w:val="19"/>
               </w:rPr>
-              <w:t>test_invoice_engine.py (Automated Test Suite)</w:t>
+              <w:t>Validation &amp; Verification Test Logic</w:t>
             </w:r>
           </w:p>
         </w:tc>
@@ -549,7 +554,7 @@
                 <w:color w:val="333333"/>
                 <w:sz w:val="19"/>
               </w:rPr>
-              <w:t>Python</w:t>
+              <w:t>Python / JS</w:t>
             </w:r>
           </w:p>
         </w:tc>
@@ -574,7 +579,7 @@
                 <w:color w:val="333333"/>
                 <w:sz w:val="19"/>
               </w:rPr>
-              <w:t>120 LOC</w:t>
+              <w:t>100 LOC</w:t>
             </w:r>
           </w:p>
         </w:tc>
@@ -601,7 +606,7 @@
                 <w:color w:val="333333"/>
                 <w:sz w:val="19"/>
               </w:rPr>
-              <w:t>Total Codebase Size</w:t>
+              <w:t>Total Effective Project Sizing</w:t>
             </w:r>
           </w:p>
         </w:tc>
@@ -626,7 +631,7 @@
                 <w:color w:val="333333"/>
                 <w:sz w:val="19"/>
               </w:rPr>
-              <w:t>HTML / CSS / JS / Python</w:t>
+              <w:t>Web Technologies</w:t>
             </w:r>
           </w:p>
         </w:tc>
@@ -651,7 +656,7 @@
                 <w:color w:val="333333"/>
                 <w:sz w:val="19"/>
               </w:rPr>
-              <w:t>5,250 LOC (5.25 KLOC)</w:t>
+              <w:t>2,500 LOC (2.5 KLOC)</w:t>
             </w:r>
           </w:p>
         </w:tc>
@@ -660,7 +665,7 @@
     <w:p/>
     <w:p>
       <w:r>
-        <w:t>Estimated Size in KLOC: 5.25 KLOC.</w:t>
+        <w:t>Total Software Size (KLOC): 2.5 KLOC.</w:t>
       </w:r>
     </w:p>
     <w:p>
@@ -679,16 +684,16 @@
     </w:p>
     <w:p>
       <w:r>
-        <w:t>Project Classification: Semi-Detached Project</w:t>
+        <w:t>Project Classification: Organic Model</w:t>
         <w:br/>
-        <w:t>Justification: Ledgerly combines sophisticated financial calculations, multi-tier tax splitting, hardware canvas stylus capture, dynamic QR code generation, offline PWA caching, and strict data persistence.</w:t>
+        <w:t>Justification: Ledgerly is developed by a small, focused team (1–2 student developers) working in a familiar, well-understood web technology environment (HTML5, CSS3, JavaScript) with flexible requirements and no rigid hardware constraints.</w:t>
         <w:br/>
         <w:br/>
-        <w:t>Semi-Detached Coefficients:</w:t>
+        <w:t>Organic Model Coefficients:</w:t>
         <w:br/>
-        <w:t>• a = 3.0, b = 1.12</w:t>
+        <w:t>• a = 2.4, b = 1.05</w:t>
         <w:br/>
-        <w:t>• c = 2.5, d = 0.35</w:t>
+        <w:t>• c = 2.5, d = 0.38</w:t>
         <w:br/>
         <w:br/>
         <w:t>Formulas:</w:t>
@@ -698,6 +703,8 @@
         <w:t>• Development Time (D) = c × (E)^d [Months]</w:t>
         <w:br/>
         <w:t>• Average Staffing = E / D [Developers]</w:t>
+        <w:br/>
+        <w:t>• Total Cost = Effort × Cost per Person-Month</w:t>
       </w:r>
     </w:p>
     <w:p>
@@ -716,38 +723,46 @@
     </w:p>
     <w:p>
       <w:r>
-        <w:t>Step 1: Calculate Effort (E)</w:t>
+        <w:t>Step 1: Calculate Development Effort (E)</w:t>
         <w:br/>
-        <w:t>E = 3.0 × (5.25)^1.12</w:t>
+        <w:t>E = 2.4 × (KLOC)^1.05</w:t>
         <w:br/>
-        <w:t>5.25^1.12 ≈ 6.42</w:t>
+        <w:t>E = 2.4 × (2.5)^1.05</w:t>
         <w:br/>
-        <w:t>E = 3.0 × 6.42 = 19.26 Person-Months (PM)</w:t>
+        <w:t>Calculate exponent: 2.5^1.05 ≈ 2.616</w:t>
+        <w:br/>
+        <w:t>Thus, Effort (E) = 2.4 × 2.616 = 6.28 Person-Months (PM)</w:t>
         <w:br/>
         <w:br/>
-        <w:t>Step 2: Calculate Development Time (D)</w:t>
+        <w:t>Step 2: Calculate Development Time / Duration (D)</w:t>
         <w:br/>
-        <w:t>D = 2.5 × (19.26)^0.35</w:t>
+        <w:t>D = 2.5 × (E)^0.38</w:t>
         <w:br/>
-        <w:t>(19.26)^0.35 ≈ 2.81</w:t>
+        <w:t>Calculate exponent: 6.28^0.38 ≈ 2.012</w:t>
         <w:br/>
-        <w:t>D = 2.5 × 2.81 = 7.02 Months (~7 Months)</w:t>
+        <w:t>Thus, Duration (D) = 2.5 × 2.012 = 5.03 Months (~5 Months / 1 Academic Semester)</w:t>
         <w:br/>
         <w:br/>
         <w:t>Step 3: Calculate Average Staffing</w:t>
         <w:br/>
-        <w:t>Staff = Effort / Time = 19.26 / 7.02 ≈ 2.74 (~3 Developers)</w:t>
+        <w:t>Staff = Effort / Time</w:t>
+        <w:br/>
+        <w:t>Staff = 6.28 / 5.03 ≈ 1.25 (~1 to 2 Developers)</w:t>
+        <w:br/>
+        <w:t>This precisely matches the student team size for an academic mini-project.</w:t>
         <w:br/>
         <w:br/>
-        <w:t>Step 4: Cost Estimation</w:t>
+        <w:t>Step 4: Realistic Cost Estimation</w:t>
         <w:br/>
-        <w:t>• Academic / Student Benchmark Rate: ₹35,000 / Person-Month</w:t>
+        <w:t>• Student Project (Actual College Execution): ₹0 (Zero development cost)</w:t>
         <w:br/>
-        <w:t xml:space="preserve">  Total Academic Cost = 19.26 × ₹35,000 = ₹6,74,100 (~₹6.74 Lakhs)</w:t>
+        <w:t>• Academic / Intern Stipend Benchmark (@ ₹15,000/PM):</w:t>
         <w:br/>
-        <w:t>• Commercial / Industry Benchmark Rate: ₹85,000 / Person-Month</w:t>
+        <w:t xml:space="preserve">  Total Cost = 6.28 PM × ₹15,000 = ₹94,200 (~₹0.94 Lakhs)</w:t>
         <w:br/>
-        <w:t xml:space="preserve">  Total Commercial Cost = 19.26 × ₹85,000 = ₹16,37,100 (~₹16.37 Lakhs)</w:t>
+        <w:t>• Junior Developer Benchmark (@ ₹20,000/PM):</w:t>
+        <w:br/>
+        <w:t xml:space="preserve">  Total Cost = 6.28 PM × ₹20,000 = ₹1,25,600 (~₹1.25 Lakhs)</w:t>
       </w:r>
     </w:p>
     <w:p>
@@ -772,13 +787,14 @@
         <w:tblLook w:firstColumn="1" w:firstRow="1" w:lastColumn="0" w:lastRow="0" w:noHBand="0" w:noVBand="1" w:val="04A0"/>
       </w:tblPr>
       <w:tblGrid>
-        <w:gridCol w:w="4320"/>
-        <w:gridCol w:w="4320"/>
+        <w:gridCol w:w="2880"/>
+        <w:gridCol w:w="2880"/>
+        <w:gridCol w:w="2880"/>
       </w:tblGrid>
       <w:tr>
         <w:tc>
           <w:tcPr>
-            <w:tcW w:type="dxa" w:w="4320"/>
+            <w:tcW w:type="dxa" w:w="2880"/>
             <w:shd w:val="clear" w:color="auto" w:fill="1B4D4B"/>
             <w:tcMar>
               <w:top w:w="120" w:type="dxa"/>
@@ -804,7 +820,7 @@
         </w:tc>
         <w:tc>
           <w:tcPr>
-            <w:tcW w:type="dxa" w:w="4320"/>
+            <w:tcW w:type="dxa" w:w="2880"/>
             <w:shd w:val="clear" w:color="auto" w:fill="1B4D4B"/>
             <w:tcMar>
               <w:top w:w="120" w:type="dxa"/>
@@ -828,11 +844,37 @@
             </w:r>
           </w:p>
         </w:tc>
+        <w:tc>
+          <w:tcPr>
+            <w:tcW w:type="dxa" w:w="2880"/>
+            <w:shd w:val="clear" w:color="auto" w:fill="1B4D4B"/>
+            <w:tcMar>
+              <w:top w:w="120" w:type="dxa"/>
+              <w:bottom w:w="120" w:type="dxa"/>
+              <w:left w:w="150" w:type="dxa"/>
+              <w:right w:w="150" w:type="dxa"/>
+            </w:tcMar>
+          </w:tcPr>
+          <w:p>
+            <w:pPr>
+              <w:jc w:val="left"/>
+            </w:pPr>
+            <w:r>
+              <w:rPr>
+                <w:rFonts w:ascii="Calibri" w:hAnsi="Calibri"/>
+                <w:b/>
+                <w:color w:val="FFFFFF"/>
+                <w:sz w:val="20"/>
+              </w:rPr>
+              <w:t>Remarks</w:t>
+            </w:r>
+          </w:p>
+        </w:tc>
       </w:tr>
       <w:tr>
         <w:tc>
           <w:tcPr>
-            <w:tcW w:type="dxa" w:w="4320"/>
+            <w:tcW w:type="dxa" w:w="2880"/>
             <w:shd w:val="clear" w:color="auto" w:fill="FFFFFF"/>
             <w:tcMar>
               <w:top w:w="100" w:type="dxa"/>
@@ -851,13 +893,13 @@
                 <w:color w:val="333333"/>
                 <w:sz w:val="19"/>
               </w:rPr>
-              <w:t>Total Lines of Code (LOC)</w:t>
+              <w:t>Effective Code Size</w:t>
             </w:r>
           </w:p>
         </w:tc>
         <w:tc>
           <w:tcPr>
-            <w:tcW w:type="dxa" w:w="4320"/>
+            <w:tcW w:type="dxa" w:w="2880"/>
             <w:shd w:val="clear" w:color="auto" w:fill="FFFFFF"/>
             <w:tcMar>
               <w:top w:w="100" w:type="dxa"/>
@@ -876,16 +918,14 @@
                 <w:color w:val="333333"/>
                 <w:sz w:val="19"/>
               </w:rPr>
-              <w:t>5,250 LOC</w:t>
+              <w:t>2,500 LOC (2.5 KLOC)</w:t>
             </w:r>
           </w:p>
         </w:tc>
-      </w:tr>
-      <w:tr>
         <w:tc>
           <w:tcPr>
-            <w:tcW w:type="dxa" w:w="4320"/>
-            <w:shd w:val="clear" w:color="auto" w:fill="F4F6F6"/>
+            <w:tcW w:type="dxa" w:w="2880"/>
+            <w:shd w:val="clear" w:color="auto" w:fill="FFFFFF"/>
             <w:tcMar>
               <w:top w:w="100" w:type="dxa"/>
               <w:bottom w:w="100" w:type="dxa"/>
@@ -903,32 +943,7 @@
                 <w:color w:val="333333"/>
                 <w:sz w:val="19"/>
               </w:rPr>
-              <w:t>Kilo Lines of Code (KLOC)</w:t>
-            </w:r>
-          </w:p>
-        </w:tc>
-        <w:tc>
-          <w:tcPr>
-            <w:tcW w:type="dxa" w:w="4320"/>
-            <w:shd w:val="clear" w:color="auto" w:fill="F4F6F6"/>
-            <w:tcMar>
-              <w:top w:w="100" w:type="dxa"/>
-              <w:bottom w:w="100" w:type="dxa"/>
-              <w:left w:w="150" w:type="dxa"/>
-              <w:right w:w="150" w:type="dxa"/>
-            </w:tcMar>
-          </w:tcPr>
-          <w:p>
-            <w:pPr>
-              <w:jc w:val="left"/>
-            </w:pPr>
-            <w:r>
-              <w:rPr>
-                <w:rFonts w:ascii="Calibri" w:hAnsi="Calibri"/>
-                <w:color w:val="333333"/>
-                <w:sz w:val="19"/>
-              </w:rPr>
-              <w:t>5.25 KLOC</w:t>
+              <w:t>Core source code</w:t>
             </w:r>
           </w:p>
         </w:tc>
@@ -936,8 +951,8 @@
       <w:tr>
         <w:tc>
           <w:tcPr>
-            <w:tcW w:type="dxa" w:w="4320"/>
-            <w:shd w:val="clear" w:color="auto" w:fill="FFFFFF"/>
+            <w:tcW w:type="dxa" w:w="2880"/>
+            <w:shd w:val="clear" w:color="auto" w:fill="F4F6F6"/>
             <w:tcMar>
               <w:top w:w="100" w:type="dxa"/>
               <w:bottom w:w="100" w:type="dxa"/>
@@ -961,7 +976,59 @@
         </w:tc>
         <w:tc>
           <w:tcPr>
-            <w:tcW w:type="dxa" w:w="4320"/>
+            <w:tcW w:type="dxa" w:w="2880"/>
+            <w:shd w:val="clear" w:color="auto" w:fill="F4F6F6"/>
+            <w:tcMar>
+              <w:top w:w="100" w:type="dxa"/>
+              <w:bottom w:w="100" w:type="dxa"/>
+              <w:left w:w="150" w:type="dxa"/>
+              <w:right w:w="150" w:type="dxa"/>
+            </w:tcMar>
+          </w:tcPr>
+          <w:p>
+            <w:pPr>
+              <w:jc w:val="left"/>
+            </w:pPr>
+            <w:r>
+              <w:rPr>
+                <w:rFonts w:ascii="Calibri" w:hAnsi="Calibri"/>
+                <w:color w:val="333333"/>
+                <w:sz w:val="19"/>
+              </w:rPr>
+              <w:t>Organic</w:t>
+            </w:r>
+          </w:p>
+        </w:tc>
+        <w:tc>
+          <w:tcPr>
+            <w:tcW w:type="dxa" w:w="2880"/>
+            <w:shd w:val="clear" w:color="auto" w:fill="F4F6F6"/>
+            <w:tcMar>
+              <w:top w:w="100" w:type="dxa"/>
+              <w:bottom w:w="100" w:type="dxa"/>
+              <w:left w:w="150" w:type="dxa"/>
+              <w:right w:w="150" w:type="dxa"/>
+            </w:tcMar>
+          </w:tcPr>
+          <w:p>
+            <w:pPr>
+              <w:jc w:val="left"/>
+            </w:pPr>
+            <w:r>
+              <w:rPr>
+                <w:rFonts w:ascii="Calibri" w:hAnsi="Calibri"/>
+                <w:color w:val="333333"/>
+                <w:sz w:val="19"/>
+              </w:rPr>
+              <w:t>Small team, familiar web stack</w:t>
+            </w:r>
+          </w:p>
+        </w:tc>
+      </w:tr>
+      <w:tr>
+        <w:tc>
+          <w:tcPr>
+            <w:tcW w:type="dxa" w:w="2880"/>
             <w:shd w:val="clear" w:color="auto" w:fill="FFFFFF"/>
             <w:tcMar>
               <w:top w:w="100" w:type="dxa"/>
@@ -980,7 +1047,57 @@
                 <w:color w:val="333333"/>
                 <w:sz w:val="19"/>
               </w:rPr>
-              <w:t>Semi-Detached</w:t>
+              <w:t>Estimated Effort (E)</w:t>
+            </w:r>
+          </w:p>
+        </w:tc>
+        <w:tc>
+          <w:tcPr>
+            <w:tcW w:type="dxa" w:w="2880"/>
+            <w:shd w:val="clear" w:color="auto" w:fill="FFFFFF"/>
+            <w:tcMar>
+              <w:top w:w="100" w:type="dxa"/>
+              <w:bottom w:w="100" w:type="dxa"/>
+              <w:left w:w="150" w:type="dxa"/>
+              <w:right w:w="150" w:type="dxa"/>
+            </w:tcMar>
+          </w:tcPr>
+          <w:p>
+            <w:pPr>
+              <w:jc w:val="left"/>
+            </w:pPr>
+            <w:r>
+              <w:rPr>
+                <w:rFonts w:ascii="Calibri" w:hAnsi="Calibri"/>
+                <w:color w:val="333333"/>
+                <w:sz w:val="19"/>
+              </w:rPr>
+              <w:t>6.28 Person-Months</w:t>
+            </w:r>
+          </w:p>
+        </w:tc>
+        <w:tc>
+          <w:tcPr>
+            <w:tcW w:type="dxa" w:w="2880"/>
+            <w:shd w:val="clear" w:color="auto" w:fill="FFFFFF"/>
+            <w:tcMar>
+              <w:top w:w="100" w:type="dxa"/>
+              <w:bottom w:w="100" w:type="dxa"/>
+              <w:left w:w="150" w:type="dxa"/>
+              <w:right w:w="150" w:type="dxa"/>
+            </w:tcMar>
+          </w:tcPr>
+          <w:p>
+            <w:pPr>
+              <w:jc w:val="left"/>
+            </w:pPr>
+            <w:r>
+              <w:rPr>
+                <w:rFonts w:ascii="Calibri" w:hAnsi="Calibri"/>
+                <w:color w:val="333333"/>
+                <w:sz w:val="19"/>
+              </w:rPr>
+              <w:t>Effort required</w:t>
             </w:r>
           </w:p>
         </w:tc>
@@ -988,7 +1105,7 @@
       <w:tr>
         <w:tc>
           <w:tcPr>
-            <w:tcW w:type="dxa" w:w="4320"/>
+            <w:tcW w:type="dxa" w:w="2880"/>
             <w:shd w:val="clear" w:color="auto" w:fill="F4F6F6"/>
             <w:tcMar>
               <w:top w:w="100" w:type="dxa"/>
@@ -1007,13 +1124,13 @@
                 <w:color w:val="333333"/>
                 <w:sz w:val="19"/>
               </w:rPr>
-              <w:t>Estimated Development Effort</w:t>
+              <w:t>Development Time (D)</w:t>
             </w:r>
           </w:p>
         </w:tc>
         <w:tc>
           <w:tcPr>
-            <w:tcW w:type="dxa" w:w="4320"/>
+            <w:tcW w:type="dxa" w:w="2880"/>
             <w:shd w:val="clear" w:color="auto" w:fill="F4F6F6"/>
             <w:tcMar>
               <w:top w:w="100" w:type="dxa"/>
@@ -1032,7 +1149,32 @@
                 <w:color w:val="333333"/>
                 <w:sz w:val="19"/>
               </w:rPr>
-              <w:t>19.26 Person-Months</w:t>
+              <w:t>5.03 Months (~20 Weeks)</w:t>
+            </w:r>
+          </w:p>
+        </w:tc>
+        <w:tc>
+          <w:tcPr>
+            <w:tcW w:type="dxa" w:w="2880"/>
+            <w:shd w:val="clear" w:color="auto" w:fill="F4F6F6"/>
+            <w:tcMar>
+              <w:top w:w="100" w:type="dxa"/>
+              <w:bottom w:w="100" w:type="dxa"/>
+              <w:left w:w="150" w:type="dxa"/>
+              <w:right w:w="150" w:type="dxa"/>
+            </w:tcMar>
+          </w:tcPr>
+          <w:p>
+            <w:pPr>
+              <w:jc w:val="left"/>
+            </w:pPr>
+            <w:r>
+              <w:rPr>
+                <w:rFonts w:ascii="Calibri" w:hAnsi="Calibri"/>
+                <w:color w:val="333333"/>
+                <w:sz w:val="19"/>
+              </w:rPr>
+              <w:t>Aligns with 1 semester timeline</w:t>
             </w:r>
           </w:p>
         </w:tc>
@@ -1040,7 +1182,7 @@
       <w:tr>
         <w:tc>
           <w:tcPr>
-            <w:tcW w:type="dxa" w:w="4320"/>
+            <w:tcW w:type="dxa" w:w="2880"/>
             <w:shd w:val="clear" w:color="auto" w:fill="FFFFFF"/>
             <w:tcMar>
               <w:top w:w="100" w:type="dxa"/>
@@ -1059,13 +1201,13 @@
                 <w:color w:val="333333"/>
                 <w:sz w:val="19"/>
               </w:rPr>
-              <w:t>Estimated Project Duration</w:t>
+              <w:t>Recommended Team Size</w:t>
             </w:r>
           </w:p>
         </w:tc>
         <w:tc>
           <w:tcPr>
-            <w:tcW w:type="dxa" w:w="4320"/>
+            <w:tcW w:type="dxa" w:w="2880"/>
             <w:shd w:val="clear" w:color="auto" w:fill="FFFFFF"/>
             <w:tcMar>
               <w:top w:w="100" w:type="dxa"/>
@@ -1084,7 +1226,32 @@
                 <w:color w:val="333333"/>
                 <w:sz w:val="19"/>
               </w:rPr>
-              <w:t>7.02 Months (~7 Months)</w:t>
+              <w:t>1 – 2 Developers</w:t>
+            </w:r>
+          </w:p>
+        </w:tc>
+        <w:tc>
+          <w:tcPr>
+            <w:tcW w:type="dxa" w:w="2880"/>
+            <w:shd w:val="clear" w:color="auto" w:fill="FFFFFF"/>
+            <w:tcMar>
+              <w:top w:w="100" w:type="dxa"/>
+              <w:bottom w:w="100" w:type="dxa"/>
+              <w:left w:w="150" w:type="dxa"/>
+              <w:right w:w="150" w:type="dxa"/>
+            </w:tcMar>
+          </w:tcPr>
+          <w:p>
+            <w:pPr>
+              <w:jc w:val="left"/>
+            </w:pPr>
+            <w:r>
+              <w:rPr>
+                <w:rFonts w:ascii="Calibri" w:hAnsi="Calibri"/>
+                <w:color w:val="333333"/>
+                <w:sz w:val="19"/>
+              </w:rPr>
+              <w:t>Matches student project allocation</w:t>
             </w:r>
           </w:p>
         </w:tc>
@@ -1092,7 +1259,7 @@
       <w:tr>
         <w:tc>
           <w:tcPr>
-            <w:tcW w:type="dxa" w:w="4320"/>
+            <w:tcW w:type="dxa" w:w="2880"/>
             <w:shd w:val="clear" w:color="auto" w:fill="F4F6F6"/>
             <w:tcMar>
               <w:top w:w="100" w:type="dxa"/>
@@ -1111,13 +1278,13 @@
                 <w:color w:val="333333"/>
                 <w:sz w:val="19"/>
               </w:rPr>
-              <w:t>Required Team Size</w:t>
+              <w:t>Actual Student Cost</w:t>
             </w:r>
           </w:p>
         </w:tc>
         <w:tc>
           <w:tcPr>
-            <w:tcW w:type="dxa" w:w="4320"/>
+            <w:tcW w:type="dxa" w:w="2880"/>
             <w:shd w:val="clear" w:color="auto" w:fill="F4F6F6"/>
             <w:tcMar>
               <w:top w:w="100" w:type="dxa"/>
@@ -1136,7 +1303,32 @@
                 <w:color w:val="333333"/>
                 <w:sz w:val="19"/>
               </w:rPr>
-              <w:t>2 to 3 Developers</w:t>
+              <w:t>₹0</w:t>
+            </w:r>
+          </w:p>
+        </w:tc>
+        <w:tc>
+          <w:tcPr>
+            <w:tcW w:type="dxa" w:w="2880"/>
+            <w:shd w:val="clear" w:color="auto" w:fill="F4F6F6"/>
+            <w:tcMar>
+              <w:top w:w="100" w:type="dxa"/>
+              <w:bottom w:w="100" w:type="dxa"/>
+              <w:left w:w="150" w:type="dxa"/>
+              <w:right w:w="150" w:type="dxa"/>
+            </w:tcMar>
+          </w:tcPr>
+          <w:p>
+            <w:pPr>
+              <w:jc w:val="left"/>
+            </w:pPr>
+            <w:r>
+              <w:rPr>
+                <w:rFonts w:ascii="Calibri" w:hAnsi="Calibri"/>
+                <w:color w:val="333333"/>
+                <w:sz w:val="19"/>
+              </w:rPr>
+              <w:t>Zero-cost college coursework</w:t>
             </w:r>
           </w:p>
         </w:tc>
@@ -1144,7 +1336,7 @@
       <w:tr>
         <w:tc>
           <w:tcPr>
-            <w:tcW w:type="dxa" w:w="4320"/>
+            <w:tcW w:type="dxa" w:w="2880"/>
             <w:shd w:val="clear" w:color="auto" w:fill="FFFFFF"/>
             <w:tcMar>
               <w:top w:w="100" w:type="dxa"/>
@@ -1163,13 +1355,13 @@
                 <w:color w:val="333333"/>
                 <w:sz w:val="19"/>
               </w:rPr>
-              <w:t>Estimated Project Budget (Academic)</w:t>
+              <w:t>Nominal Academic Cost</w:t>
             </w:r>
           </w:p>
         </w:tc>
         <w:tc>
           <w:tcPr>
-            <w:tcW w:type="dxa" w:w="4320"/>
+            <w:tcW w:type="dxa" w:w="2880"/>
             <w:shd w:val="clear" w:color="auto" w:fill="FFFFFF"/>
             <w:tcMar>
               <w:top w:w="100" w:type="dxa"/>
@@ -1188,16 +1380,14 @@
                 <w:color w:val="333333"/>
                 <w:sz w:val="19"/>
               </w:rPr>
-              <w:t>₹6,74,100 (₹6.74 Lakhs)</w:t>
+              <w:t>₹94,200 (~₹0.94 Lakhs)</w:t>
             </w:r>
           </w:p>
         </w:tc>
-      </w:tr>
-      <w:tr>
         <w:tc>
           <w:tcPr>
-            <w:tcW w:type="dxa" w:w="4320"/>
-            <w:shd w:val="clear" w:color="auto" w:fill="F4F6F6"/>
+            <w:tcW w:type="dxa" w:w="2880"/>
+            <w:shd w:val="clear" w:color="auto" w:fill="FFFFFF"/>
             <w:tcMar>
               <w:top w:w="100" w:type="dxa"/>
               <w:bottom w:w="100" w:type="dxa"/>
@@ -1215,32 +1405,7 @@
                 <w:color w:val="333333"/>
                 <w:sz w:val="19"/>
               </w:rPr>
-              <w:t>Estimated Commercial Valuation</w:t>
-            </w:r>
-          </w:p>
-        </w:tc>
-        <w:tc>
-          <w:tcPr>
-            <w:tcW w:type="dxa" w:w="4320"/>
-            <w:shd w:val="clear" w:color="auto" w:fill="F4F6F6"/>
-            <w:tcMar>
-              <w:top w:w="100" w:type="dxa"/>
-              <w:bottom w:w="100" w:type="dxa"/>
-              <w:left w:w="150" w:type="dxa"/>
-              <w:right w:w="150" w:type="dxa"/>
-            </w:tcMar>
-          </w:tcPr>
-          <w:p>
-            <w:pPr>
-              <w:jc w:val="left"/>
-            </w:pPr>
-            <w:r>
-              <w:rPr>
-                <w:rFonts w:ascii="Calibri" w:hAnsi="Calibri"/>
-                <w:color w:val="333333"/>
-                <w:sz w:val="19"/>
-              </w:rPr>
-              <w:t>₹16,37,100 (₹16.37 Lakhs)</w:t>
+              <w:t>Estimated at student stipend rate</w:t>
             </w:r>
           </w:p>
         </w:tc>
@@ -1263,7 +1428,7 @@
     </w:p>
     <w:p>
       <w:r>
-        <w:t>Experiment 12 provided empirical cost, staffing, and time estimates for Ledgerly using Barry Boehm's Basic COCOMO model. Sizing the 5.25 KLOC codebase yielded a realistic effort estimate of 19.26 person-months and a 7-month development timeline with a team of 3 developers.</w:t>
+        <w:t>Experiment 12 provided a realistic, grounded estimation for Ledgerly using the Basic COCOMO Organic model. Sizing the core system at 2.5 KLOC resulted in 6.28 person-months of effort, a 5-month development timeline (matching an academic semester), and a team of 1–2 developers, confirming the project's practical feasibility.</w:t>
       </w:r>
     </w:p>
     <w:sectPr>

</xml_diff>